<commit_message>
feat: Add Phase 5 strategic features (Excel Owners Statement, VA/QRIS, Fit-Out SIK PDF, WBP/LWBP tariffs, CSAT rating)
- Add multi-tab Excel export (.xlsx) on Owner Statement Wizard
- Add Virtual Account (BCA, Mandiri, BNI, BRI, Permata, CIMB) & QRIS generator on contracts & invoices
- Add Fit-Out Permit / Surat Izin Kerja (SIK) model, workflow, views, and printable QWeb PDF
- Add PLN B3/I3 peak/off-peak (WBP/LWBP) dual electricity tariffs and meter reading computation
- Add CSAT star rating & feedback submission on tenant maintenance portal
- Update SOP User Guide and UAT test cases (Total: 69 TCs)
</commit_message>
<xml_diff>
--- a/Rental Property Management - Odoo 19 Custom Addon/docs/Panduan_Pengguna_Fitur_Sesuai_Alur_Bisnis.docx
+++ b/Rental Property Management - Odoo 19 Custom Addon/docs/Panduan_Pengguna_Fitur_Sesuai_Alur_Bisnis.docx
@@ -152,8 +152,11 @@
       </w:r>
     </w:p>
     <w:p>
-      <w:r>
-        <w:t>6. [Billing Bulanan, Bulk Meter Reading &amp; Deklarasi GTO Omzet](#6-billing-bulanan-bulk-meter-reading--deklarasi-gto-omzet)</w:t>
+      <w:pPr>
+        <w:pStyle w:val="ListNumber"/>
+      </w:pPr>
+      <w:r>
+        <w:t>[Billing Bulanan, Bulk Meter Reading &amp; Deklarasi GTO Omzet](#6-billing-bulanan-bulk-meter-reading--deklarasi-gto-omzet)</w:t>
       </w:r>
     </w:p>
     <w:p>
@@ -183,12 +186,27 @@
     </w:p>
     <w:p>
       <w:r>
-        <w:t>12. [Laporan Keuangan Pemilik (Owners Statement) Konsolidasi 16 PT](#12-laporan-keuangan-pemilik-owners-statement-konsolidasi-16-pt)</w:t>
+        <w:t>12. [Laporan Keuangan Pemilik (Owners Statement) Konsolidasi 16 PT &amp; Ekspor Excel](#12-laporan-keuangan-pemilik-owners-statement-konsolidasi-16-pt--ekspor-excel)</w:t>
       </w:r>
     </w:p>
     <w:p>
       <w:r>
         <w:t>13. [Manajemen Perizinan &amp; Dokumen Legal Gedung](#13-manajemen-perizinan--dokumen-legal-gedung)</w:t>
+      </w:r>
+    </w:p>
+    <w:p>
+      <w:r>
+        <w:t>14. [Surat Izin Kerja (SIK) Renovasi / Fit-Out Work Permit](#14-surat-izin-kerja-sik-renovasi--fit-out-work-permit)</w:t>
+      </w:r>
+    </w:p>
+    <w:p>
+      <w:r>
+        <w:t>15. [Tarif Listrik Beban Puncak PLN (WBP / LWBP) &amp; Utilitas Ganda](#15-tarif-listrik-beban-puncak-pln-wbp--lwbp--utilitas-ganda)</w:t>
+      </w:r>
+    </w:p>
+    <w:p>
+      <w:r>
+        <w:t>16. [Rating Kepuasan Tenant (CSAT) pada Portal Maintenance](#16-rating-kepuasan-tenant-csat-pada-portal-maintenance)</w:t>
       </w:r>
     </w:p>
     <w:p>
@@ -770,8 +788,11 @@
       </w:r>
     </w:p>
     <w:p>
-      <w:r>
-        <w:t xml:space="preserve">6. Catat </w:t>
+      <w:pPr>
+        <w:pStyle w:val="ListNumber"/>
+      </w:pPr>
+      <w:r>
+        <w:t xml:space="preserve">Catat </w:t>
       </w:r>
       <w:r>
         <w:rPr>
@@ -2011,7 +2032,7 @@
         <w:spacing w:before="280" w:after="80"/>
       </w:pPr>
       <w:r>
-        <w:t>12. Laporan Keuangan Pemilik (Owners Statement) Konsolidasi 16 PT</w:t>
+        <w:t>12. Laporan Keuangan Pemilik (Owners Statement) Konsolidasi 16 PT &amp; Ekspor Excel</w:t>
       </w:r>
     </w:p>
     <w:p>
@@ -2123,6 +2144,23 @@
         <w:pStyle w:val="ListNumber"/>
       </w:pPr>
       <w:r>
+        <w:t xml:space="preserve">Klik </w:t>
+      </w:r>
+      <w:r>
+        <w:rPr>
+          <w:b/>
+        </w:rPr>
+        <w:t>"📊 Ekspor Excel (.xlsx)"</w:t>
+      </w:r>
+      <w:r>
+        <w:t xml:space="preserve"> untuk mengunduh spreadsheet Excel multi-tab (*Summary, Income &amp; Expenditure, Receipts &amp; Payments, Tenant Balances, Trial Balance*) dengan formula dan format sel rapi.</w:t>
+      </w:r>
+    </w:p>
+    <w:p>
+      <w:pPr>
+        <w:pStyle w:val="ListNumber"/>
+      </w:pPr>
+      <w:r>
         <w:t xml:space="preserve">Klik tombol </w:t>
       </w:r>
       <w:r>
@@ -2252,6 +2290,269 @@
       </w:pPr>
       <w:r>
         <w:t>Setiap dokumen dilengkapi tanggal kedaluwarsa (*expiry date*) dan notifikasi pengingat perpanjangan sebelum izin habis masa berlaku.</w:t>
+      </w:r>
+    </w:p>
+    <w:p>
+      <w:r>
+        <w:t>---</w:t>
+      </w:r>
+    </w:p>
+    <w:p>
+      <w:pPr>
+        <w:pStyle w:val="Heading1"/>
+        <w:spacing w:before="280" w:after="80"/>
+      </w:pPr>
+      <w:r>
+        <w:t>14. Surat Izin Kerja (SIK) Renovasi / Fit-Out Work Permit</w:t>
+      </w:r>
+    </w:p>
+    <w:p>
+      <w:r>
+        <w:t>Sebelum kontraktor tenant memulai pekerjaan fisik/dekorasi:</w:t>
+      </w:r>
+    </w:p>
+    <w:p>
+      <w:pPr>
+        <w:pStyle w:val="ListNumber"/>
+      </w:pPr>
+      <w:r>
+        <w:t xml:space="preserve">Buka menu: </w:t>
+      </w:r>
+      <w:r>
+        <w:rPr>
+          <w:b/>
+        </w:rPr>
+        <w:t>Rental Management &gt; Surat Izin Kerja (SIK)</w:t>
+      </w:r>
+      <w:r>
+        <w:t>.</w:t>
+      </w:r>
+    </w:p>
+    <w:p>
+      <w:pPr>
+        <w:pStyle w:val="ListNumber"/>
+      </w:pPr>
+      <w:r>
+        <w:t xml:space="preserve">Klik </w:t>
+      </w:r>
+      <w:r>
+        <w:rPr>
+          <w:b/>
+        </w:rPr>
+        <w:t>New</w:t>
+      </w:r>
+      <w:r>
+        <w:t>, pilih Kontrak Sewa (`tenancy.details`).</w:t>
+      </w:r>
+    </w:p>
+    <w:p>
+      <w:pPr>
+        <w:pStyle w:val="ListNumber"/>
+      </w:pPr>
+      <w:r>
+        <w:t>Masukkan identitas kontraktor pelaksana, nama PIC, nomor WhatsApp, dan jumlah pekerja.</w:t>
+      </w:r>
+    </w:p>
+    <w:p>
+      <w:pPr>
+        <w:pStyle w:val="ListNumber"/>
+      </w:pPr>
+      <w:r>
+        <w:t xml:space="preserve">Tentukan </w:t>
+      </w:r>
+      <w:r>
+        <w:rPr>
+          <w:b/>
+        </w:rPr>
+        <w:t>Kategori Pekerjaan</w:t>
+      </w:r>
+      <w:r>
+        <w:t xml:space="preserve"> (*Minor Fit-Out, Renovasi Mayor, MEP, Pembongkaran*) dan </w:t>
+      </w:r>
+      <w:r>
+        <w:rPr>
+          <w:b/>
+        </w:rPr>
+        <w:t>Jam Kerja</w:t>
+      </w:r>
+      <w:r>
+        <w:t xml:space="preserve"> (*Siang Hari, Malam Hari 21:00-05:00, Weekend*).</w:t>
+      </w:r>
+    </w:p>
+    <w:p>
+      <w:pPr>
+        <w:pStyle w:val="ListNumber"/>
+      </w:pPr>
+      <w:r>
+        <w:t xml:space="preserve">Aktifkan opsi </w:t>
+      </w:r>
+      <w:r>
+        <w:rPr>
+          <w:b/>
+        </w:rPr>
+        <w:t>"Izin Pengelasan / Hot Work Permit"</w:t>
+      </w:r>
+      <w:r>
+        <w:t xml:space="preserve"> jika ada pekerjaan panas serta verifikasi ketersediaan APAR dan Safety Briefing K3.</w:t>
+      </w:r>
+    </w:p>
+    <w:p>
+      <w:pPr>
+        <w:pStyle w:val="ListNumber"/>
+      </w:pPr>
+      <w:r>
+        <w:t xml:space="preserve">Klik </w:t>
+      </w:r>
+      <w:r>
+        <w:rPr>
+          <w:b/>
+        </w:rPr>
+        <w:t>"✅ Setujui SIK"</w:t>
+      </w:r>
+      <w:r>
+        <w:t xml:space="preserve">, lalu klik </w:t>
+      </w:r>
+      <w:r>
+        <w:rPr>
+          <w:b/>
+        </w:rPr>
+        <w:t>"🖨️ Cetak SIK (PDF)"</w:t>
+      </w:r>
+      <w:r>
+        <w:t xml:space="preserve"> untuk mencetak Surat Izin Kerja resmi bertandatangan 3 pihak (*Kontraktor, Tenant, Building Management*).</w:t>
+      </w:r>
+    </w:p>
+    <w:p>
+      <w:r>
+        <w:t>---</w:t>
+      </w:r>
+    </w:p>
+    <w:p>
+      <w:pPr>
+        <w:pStyle w:val="Heading1"/>
+        <w:spacing w:before="280" w:after="80"/>
+      </w:pPr>
+      <w:r>
+        <w:t>15. Tarif Listrik Beban Puncak PLN (WBP / LWBP) &amp; Utilitas Ganda</w:t>
+      </w:r>
+    </w:p>
+    <w:p>
+      <w:r>
+        <w:t>Khusus tenant komersial golongan tarif PLN B3/I3:</w:t>
+      </w:r>
+    </w:p>
+    <w:p>
+      <w:pPr>
+        <w:pStyle w:val="ListNumber"/>
+      </w:pPr>
+      <w:r>
+        <w:t xml:space="preserve">Pada form meteran listrik (`property.meter`), centang opsi </w:t>
+      </w:r>
+      <w:r>
+        <w:rPr>
+          <w:b/>
+        </w:rPr>
+        <w:t>"Tarif Beban Puncak PLN (WBP / LWBP)"</w:t>
+      </w:r>
+      <w:r>
+        <w:t>.</w:t>
+      </w:r>
+    </w:p>
+    <w:p>
+      <w:pPr>
+        <w:pStyle w:val="ListNumber"/>
+      </w:pPr>
+      <w:r>
+        <w:t xml:space="preserve">Masukkan </w:t>
+      </w:r>
+      <w:r>
+        <w:rPr>
+          <w:b/>
+        </w:rPr>
+        <w:t>Tarif WBP (Beban Puncak)</w:t>
+      </w:r>
+      <w:r>
+        <w:t xml:space="preserve"> dan </w:t>
+      </w:r>
+      <w:r>
+        <w:rPr>
+          <w:b/>
+        </w:rPr>
+        <w:t>Tarif LWBP (Luar Beban Puncak)</w:t>
+      </w:r>
+      <w:r>
+        <w:t>.</w:t>
+      </w:r>
+    </w:p>
+    <w:p>
+      <w:pPr>
+        <w:pStyle w:val="ListNumber"/>
+      </w:pPr>
+      <w:r>
+        <w:t>Saat mencatat meteran (`property.meter.reading`), masukkan angka stand meter WBP dan LWBP secara terpisah.</w:t>
+      </w:r>
+    </w:p>
+    <w:p>
+      <w:pPr>
+        <w:pStyle w:val="ListNumber"/>
+      </w:pPr>
+      <w:r>
+        <w:t>Sistem secara otomatis menghitung pemakaian kwh dan subtotal biaya masing-masing beban puncak, lalu menggabungkannya ke dalam 1 invoice tagihan utilitas bulanan.</w:t>
+      </w:r>
+    </w:p>
+    <w:p>
+      <w:r>
+        <w:t>---</w:t>
+      </w:r>
+    </w:p>
+    <w:p>
+      <w:pPr>
+        <w:pStyle w:val="Heading1"/>
+        <w:spacing w:before="280" w:after="80"/>
+      </w:pPr>
+      <w:r>
+        <w:t>16. Rating Kepuasan Tenant (CSAT) pada Portal Maintenance</w:t>
+      </w:r>
+    </w:p>
+    <w:p>
+      <w:pPr>
+        <w:pStyle w:val="ListNumber"/>
+      </w:pPr>
+      <w:r>
+        <w:t>Saat tiket pemeliharaan (*Maintenance Request*) telah selesai dikerjakan oleh tim Engineering/Teknisi.</w:t>
+      </w:r>
+    </w:p>
+    <w:p>
+      <w:pPr>
+        <w:pStyle w:val="ListNumber"/>
+      </w:pPr>
+      <w:r>
+        <w:t>Tenant membuka halaman tiket di portal `/my/maintenance/&lt;id&gt;`.</w:t>
+      </w:r>
+    </w:p>
+    <w:p>
+      <w:pPr>
+        <w:pStyle w:val="ListNumber"/>
+      </w:pPr>
+      <w:r>
+        <w:t xml:space="preserve">Tenant dapat memberikan </w:t>
+      </w:r>
+      <w:r>
+        <w:rPr>
+          <w:b/>
+        </w:rPr>
+        <w:t>Rating Bintang (1 s.d. 5 Bintang)</w:t>
+      </w:r>
+      <w:r>
+        <w:t xml:space="preserve"> dan ulasan masukan (*feedback*) kepuasan pelayanan.</w:t>
+      </w:r>
+    </w:p>
+    <w:p>
+      <w:pPr>
+        <w:pStyle w:val="ListNumber"/>
+      </w:pPr>
+      <w:r>
+        <w:t>Nilai kepuasan CSAT otomatis tercatat pada backend Odoo dan muncul sebagai indikator penilaian SLA kinerja tim operasional gedung.</w:t>
       </w:r>
     </w:p>
     <w:p>

</xml_diff>

<commit_message>
feat: Add Phase 7 enterprise enhancements (Parking RFID, 12M Cash Flow, Facility Booking, FX Lease Rates, Lease Amendment)
- Add Tenant Parking Pass (property.parking.pass) RFID registration, quotas, and printable PDF
- Add 12-Month Rolling Cash Flow Projection wizard (PDF & multi-tab Excel export)
- Add Function Room & Facility Booking (property.facility.booking) with conflict check & auto-invoicing
- Add Foreign Currency (USD/SGD) Lease handling with official KMK & BI exchange rates in CORETAX
- Add Lease Amendment & Rent Review Tracking (property.tenancy.amendment) with contract update & printable PDF
- Update User Guide (25 Chapters) and UAT Tracker (78 Test Cases)
</commit_message>
<xml_diff>
--- a/Rental Property Management - Odoo 19 Custom Addon/docs/Panduan_Pengguna_Fitur_Sesuai_Alur_Bisnis.docx
+++ b/Rental Property Management - Odoo 19 Custom Addon/docs/Panduan_Pengguna_Fitur_Sesuai_Alur_Bisnis.docx
@@ -160,18 +160,27 @@
       </w:r>
     </w:p>
     <w:p>
-      <w:r>
-        <w:t>7. [Integrasi Pajak Indonesia: CORETAX e-Faktur &amp; PPh Final 4(2) 10%](#7-integrasi-pajak-indonesia-coretax-e-faktur--pph-final-42-10)</w:t>
+      <w:pPr>
+        <w:pStyle w:val="ListNumber"/>
+      </w:pPr>
+      <w:r>
+        <w:t>[Integrasi Pajak Indonesia: CORETAX e-Faktur &amp; PPh Final 4(2) 10%](#7-integrasi-pajak-indonesia-coretax-e-faktur--pph-final-42-10)</w:t>
       </w:r>
     </w:p>
     <w:p>
-      <w:r>
-        <w:t>8. [Penagihan &amp; Dunning SP1–SP3, WhatsApp, Cetak SP &amp; Segel Unit](#8-penagihan--dunning-sp1sp3-whatsapp-cetak-sp--segel-unit)</w:t>
+      <w:pPr>
+        <w:pStyle w:val="ListNumber"/>
+      </w:pPr>
+      <w:r>
+        <w:t>[Penagihan &amp; Dunning SP1–SP3, WhatsApp, Cetak SP &amp; Segel Unit](#8-penagihan--dunning-sp1sp3-whatsapp-cetak-sp--segel-unit)</w:t>
       </w:r>
     </w:p>
     <w:p>
-      <w:r>
-        <w:t>9. [Tenant Self-Service Portal (Bukti Bayar, BAST, Maintenance)](#9-tenant-self-service-portal-bukti-bayar-bast-maintenance)</w:t>
+      <w:pPr>
+        <w:pStyle w:val="ListNumber"/>
+      </w:pPr>
+      <w:r>
+        <w:t>[Tenant Self-Service Portal (Bukti Bayar, BAST, Maintenance)](#9-tenant-self-service-portal-bukti-bayar-bast-maintenance)</w:t>
       </w:r>
     </w:p>
     <w:p>
@@ -2553,6 +2562,491 @@
       </w:pPr>
       <w:r>
         <w:t>Nilai kepuasan CSAT otomatis tercatat pada backend Odoo dan muncul sebagai indikator penilaian SLA kinerja tim operasional gedung.</w:t>
+      </w:r>
+    </w:p>
+    <w:p>
+      <w:r>
+        <w:t>---</w:t>
+      </w:r>
+    </w:p>
+    <w:p>
+      <w:r>
+        <w:t>---</w:t>
+      </w:r>
+    </w:p>
+    <w:p>
+      <w:pPr>
+        <w:pStyle w:val="Heading1"/>
+        <w:spacing w:before="280" w:after="80"/>
+      </w:pPr>
+      <w:r>
+        <w:t>21. Manajemen Langganan Parkir Tenant &amp; Kendaraan RFID</w:t>
+      </w:r>
+    </w:p>
+    <w:p>
+      <w:r>
+        <w:t>Untuk mengelola alokasi parkir kendaraan penyewa (mobil, motor, slot VIP):</w:t>
+      </w:r>
+    </w:p>
+    <w:p>
+      <w:pPr>
+        <w:pStyle w:val="ListNumber"/>
+      </w:pPr>
+      <w:r>
+        <w:t xml:space="preserve">Buka menu: </w:t>
+      </w:r>
+      <w:r>
+        <w:rPr>
+          <w:b/>
+        </w:rPr>
+        <w:t>Rental Management &gt; Langganan Parkir Tenant</w:t>
+      </w:r>
+      <w:r>
+        <w:t>.</w:t>
+      </w:r>
+    </w:p>
+    <w:p>
+      <w:pPr>
+        <w:pStyle w:val="ListNumber"/>
+      </w:pPr>
+      <w:r>
+        <w:t xml:space="preserve">Klik </w:t>
+      </w:r>
+      <w:r>
+        <w:rPr>
+          <w:b/>
+        </w:rPr>
+        <w:t>New</w:t>
+      </w:r>
+      <w:r>
+        <w:t>, pilih Kontrak Sewa (`tenancy.details`).</w:t>
+      </w:r>
+    </w:p>
+    <w:p>
+      <w:pPr>
+        <w:pStyle w:val="ListNumber"/>
+      </w:pPr>
+      <w:r>
+        <w:t>Masukkan data: Nomor Polisi (Plat Nomor), Merk/Model Kendaraan, Nama Pengemudi/Karyawan Tenant, dan Nomor Kartu RFID Parkir.</w:t>
+      </w:r>
+    </w:p>
+    <w:p>
+      <w:pPr>
+        <w:pStyle w:val="ListNumber"/>
+      </w:pPr>
+      <w:r>
+        <w:t xml:space="preserve">Tentukan </w:t>
+      </w:r>
+      <w:r>
+        <w:rPr>
+          <w:b/>
+        </w:rPr>
+        <w:t>Kategori Kuota</w:t>
+      </w:r>
+      <w:r>
+        <w:t>:</w:t>
+      </w:r>
+    </w:p>
+    <w:p>
+      <w:pPr>
+        <w:pStyle w:val="ListBullet"/>
+      </w:pPr>
+      <w:r/>
+      <w:r>
+        <w:rPr>
+          <w:b/>
+        </w:rPr>
+        <w:t>Jatah Kuota Gratis (Allotted)</w:t>
+      </w:r>
+      <w:r>
+        <w:t>: Kuota parkir cuma-cuma sesuai perjanjian luas sewa unit.</w:t>
+      </w:r>
+    </w:p>
+    <w:p>
+      <w:pPr>
+        <w:pStyle w:val="ListBullet"/>
+      </w:pPr>
+      <w:r/>
+      <w:r>
+        <w:rPr>
+          <w:b/>
+        </w:rPr>
+        <w:t>Langganan Berbayar Bulanan</w:t>
+      </w:r>
+      <w:r>
+        <w:t>: Dikenakan tarif sewa slot parkir bulanan.</w:t>
+      </w:r>
+    </w:p>
+    <w:p>
+      <w:pPr>
+        <w:pStyle w:val="ListNumber"/>
+      </w:pPr>
+      <w:r>
+        <w:t xml:space="preserve">Klik </w:t>
+      </w:r>
+      <w:r>
+        <w:rPr>
+          <w:b/>
+        </w:rPr>
+        <w:t>"✅ Aktifkan Pass Parkir"</w:t>
+      </w:r>
+      <w:r>
+        <w:t xml:space="preserve"> dan klik </w:t>
+      </w:r>
+      <w:r>
+        <w:rPr>
+          <w:b/>
+        </w:rPr>
+        <w:t>"🖨️ Cetak Formulir Parkir (PDF)"</w:t>
+      </w:r>
+      <w:r>
+        <w:t xml:space="preserve"> untuk mencetak bukti tanda daftar dan stiker parkir resmi.</w:t>
+      </w:r>
+    </w:p>
+    <w:p>
+      <w:r>
+        <w:t>---</w:t>
+      </w:r>
+    </w:p>
+    <w:p>
+      <w:pPr>
+        <w:pStyle w:val="Heading1"/>
+        <w:spacing w:before="280" w:after="80"/>
+      </w:pPr>
+      <w:r>
+        <w:t>22. Proyeksi Arus Kas Bergulir 12 Bulan (Rolling Cash Flow Forecast)</w:t>
+      </w:r>
+    </w:p>
+    <w:p>
+      <w:r>
+        <w:t>Untuk perencanaan likuiditas dan anggaran belanja modal (*Capex*):</w:t>
+      </w:r>
+    </w:p>
+    <w:p>
+      <w:pPr>
+        <w:pStyle w:val="ListNumber"/>
+      </w:pPr>
+      <w:r>
+        <w:t xml:space="preserve">Buka menu: </w:t>
+      </w:r>
+      <w:r>
+        <w:rPr>
+          <w:b/>
+        </w:rPr>
+        <w:t>Rental Management &gt; Reports &gt; Proyeksi Arus Kas (12 Bulan)</w:t>
+      </w:r>
+      <w:r>
+        <w:t>.</w:t>
+      </w:r>
+    </w:p>
+    <w:p>
+      <w:pPr>
+        <w:pStyle w:val="ListNumber"/>
+      </w:pPr>
+      <w:r>
+        <w:t>Tentukan Bulan Awal Proyeksi (misal: Januari 2026) dan pilih Perusahaan / PT.</w:t>
+      </w:r>
+    </w:p>
+    <w:p>
+      <w:pPr>
+        <w:pStyle w:val="ListNumber"/>
+      </w:pPr>
+      <w:r>
+        <w:t xml:space="preserve">Klik </w:t>
+      </w:r>
+      <w:r>
+        <w:rPr>
+          <w:b/>
+        </w:rPr>
+        <w:t>"🖨️ Cetak Proyeksi (PDF)"</w:t>
+      </w:r>
+      <w:r>
+        <w:t xml:space="preserve"> untuk menerbitkan laporan eksekutif arus kas 12 bulan.</w:t>
+      </w:r>
+    </w:p>
+    <w:p>
+      <w:pPr>
+        <w:pStyle w:val="ListNumber"/>
+      </w:pPr>
+      <w:r>
+        <w:t xml:space="preserve">Klik </w:t>
+      </w:r>
+      <w:r>
+        <w:rPr>
+          <w:b/>
+        </w:rPr>
+        <w:t>"📊 Ekspor Excel (.xlsx)"</w:t>
+      </w:r>
+      <w:r>
+        <w:t xml:space="preserve"> untuk mengunduh spreadsheet proyeksi multi-kolom (*Inflows, Outflows, Monthly Net Cash Flow, dan Cumulative Cash Flow*).</w:t>
+      </w:r>
+    </w:p>
+    <w:p>
+      <w:r>
+        <w:t>---</w:t>
+      </w:r>
+    </w:p>
+    <w:p>
+      <w:pPr>
+        <w:pStyle w:val="Heading1"/>
+        <w:spacing w:before="280" w:after="80"/>
+      </w:pPr>
+      <w:r>
+        <w:t>23. Pemesanan Fasilitas Bersama &amp; Ruang Rapat (Meeting Room &amp; Ballroom)</w:t>
+      </w:r>
+    </w:p>
+    <w:p>
+      <w:r>
+        <w:t>Untuk mengoptimalkan pendapatan sewa non-ruangan (*ancillary revenue*):</w:t>
+      </w:r>
+    </w:p>
+    <w:p>
+      <w:pPr>
+        <w:pStyle w:val="ListNumber"/>
+      </w:pPr>
+      <w:r>
+        <w:t xml:space="preserve">Buka menu: </w:t>
+      </w:r>
+      <w:r>
+        <w:rPr>
+          <w:b/>
+        </w:rPr>
+        <w:t>Rental Management &gt; Fasilitas &amp; Meeting Room &gt; Pemesanan Fasilitas</w:t>
+      </w:r>
+      <w:r>
+        <w:t>.</w:t>
+      </w:r>
+    </w:p>
+    <w:p>
+      <w:pPr>
+        <w:pStyle w:val="ListNumber"/>
+      </w:pPr>
+      <w:r>
+        <w:t>Pilih Fasilitas (Ruang Rapat, Ballroom, Atrium Mall, Rooftop Lounge) dan tanggal pemakaian.</w:t>
+      </w:r>
+    </w:p>
+    <w:p>
+      <w:pPr>
+        <w:pStyle w:val="ListNumber"/>
+      </w:pPr>
+      <w:r>
+        <w:t>Pilih Sesi Waktu (*Pagi, Siang, Malam, atau Seharian Penuh*). Sistem secara otomatis memeriksa ketersediaan jadwal untuk mencegah *double booking*.</w:t>
+      </w:r>
+    </w:p>
+    <w:p>
+      <w:pPr>
+        <w:pStyle w:val="ListNumber"/>
+      </w:pPr>
+      <w:r>
+        <w:t xml:space="preserve">Klik </w:t>
+      </w:r>
+      <w:r>
+        <w:rPr>
+          <w:b/>
+        </w:rPr>
+        <w:t>"✅ Konfirmasi Jadwal"</w:t>
+      </w:r>
+      <w:r>
+        <w:t xml:space="preserve">, lalu klik </w:t>
+      </w:r>
+      <w:r>
+        <w:rPr>
+          <w:b/>
+        </w:rPr>
+        <w:t>"🧾 Terbitkan Invoice"</w:t>
+      </w:r>
+      <w:r>
+        <w:t xml:space="preserve"> untuk membuat tagihan sewa fasilitas dan deposit kebersihan secara otomatis.</w:t>
+      </w:r>
+    </w:p>
+    <w:p>
+      <w:r>
+        <w:t>---</w:t>
+      </w:r>
+    </w:p>
+    <w:p>
+      <w:pPr>
+        <w:pStyle w:val="Heading1"/>
+        <w:spacing w:before="280" w:after="80"/>
+      </w:pPr>
+      <w:r>
+        <w:t>24. Kontrak Sewa Valas (USD/SGD) &amp; Kurs Pajak KMK / BI</w:t>
+      </w:r>
+    </w:p>
+    <w:p>
+      <w:r>
+        <w:t>Khusus tenant multinasional dengan tarif sewa dalam valuta asing:</w:t>
+      </w:r>
+    </w:p>
+    <w:p>
+      <w:pPr>
+        <w:pStyle w:val="ListNumber"/>
+      </w:pPr>
+      <w:r>
+        <w:t xml:space="preserve">Pada form invoice tagihan sewa (`account.move`), centang opsi </w:t>
+      </w:r>
+      <w:r>
+        <w:rPr>
+          <w:b/>
+        </w:rPr>
+        <w:t>"Kontrak Sewa Valas (USD/SGD)"</w:t>
+      </w:r>
+      <w:r>
+        <w:t>.</w:t>
+      </w:r>
+    </w:p>
+    <w:p>
+      <w:pPr>
+        <w:pStyle w:val="ListNumber"/>
+      </w:pPr>
+      <w:r>
+        <w:t>Masukkan mata uang valas (USD/SGD) dan nominal asli tagihan sewa.</w:t>
+      </w:r>
+    </w:p>
+    <w:p>
+      <w:pPr>
+        <w:pStyle w:val="ListNumber"/>
+      </w:pPr>
+      <w:r>
+        <w:t xml:space="preserve">Masukkan </w:t>
+      </w:r>
+      <w:r>
+        <w:rPr>
+          <w:b/>
+        </w:rPr>
+        <w:t>Kurs Pajak KMK</w:t>
+      </w:r>
+      <w:r>
+        <w:t xml:space="preserve"> resmi dan </w:t>
+      </w:r>
+      <w:r>
+        <w:rPr>
+          <w:b/>
+        </w:rPr>
+        <w:t>Kurs Transaksi Bank Indonesia</w:t>
+      </w:r>
+      <w:r>
+        <w:t xml:space="preserve"> pada tanggal penerbitan tagihan.</w:t>
+      </w:r>
+    </w:p>
+    <w:p>
+      <w:pPr>
+        <w:pStyle w:val="ListNumber"/>
+      </w:pPr>
+      <w:r>
+        <w:t>Nilai DPP dan PPN dikonversi otomatis ke Rupiah (IDR) untuk pelaporan e-Faktur CORETAX DJP.</w:t>
+      </w:r>
+    </w:p>
+    <w:p>
+      <w:r>
+        <w:t>---</w:t>
+      </w:r>
+    </w:p>
+    <w:p>
+      <w:pPr>
+        <w:pStyle w:val="Heading1"/>
+        <w:spacing w:before="280" w:after="80"/>
+      </w:pPr>
+      <w:r>
+        <w:t>25. Adendum Kontrak &amp; Audit Trail Perubahan Sewa</w:t>
+      </w:r>
+    </w:p>
+    <w:p>
+      <w:r>
+        <w:t>Jika terjadi perubahan klausul kontrak di tengah masa sewa berjalan:</w:t>
+      </w:r>
+    </w:p>
+    <w:p>
+      <w:pPr>
+        <w:pStyle w:val="ListNumber"/>
+      </w:pPr>
+      <w:r>
+        <w:t xml:space="preserve">Buka menu: </w:t>
+      </w:r>
+      <w:r>
+        <w:rPr>
+          <w:b/>
+        </w:rPr>
+        <w:t>Rental Management &gt; Contracts &gt; Adendum &amp; Perubahan Kontrak</w:t>
+      </w:r>
+      <w:r>
+        <w:t>.</w:t>
+      </w:r>
+    </w:p>
+    <w:p>
+      <w:pPr>
+        <w:pStyle w:val="ListNumber"/>
+      </w:pPr>
+      <w:r>
+        <w:t xml:space="preserve">Klik </w:t>
+      </w:r>
+      <w:r>
+        <w:rPr>
+          <w:b/>
+        </w:rPr>
+        <w:t>New</w:t>
+      </w:r>
+      <w:r>
+        <w:t>, pilih Kontrak Sewa Induk (`tenancy.details`).</w:t>
+      </w:r>
+    </w:p>
+    <w:p>
+      <w:pPr>
+        <w:pStyle w:val="ListNumber"/>
+      </w:pPr>
+      <w:r>
+        <w:t>Pilih Jenis Adendum (*Penyesuaian Tarif Sewa, Perubahan Luas Unit m², Perpanjangan Masa Sewa, atau Grace Period*).</w:t>
+      </w:r>
+    </w:p>
+    <w:p>
+      <w:pPr>
+        <w:pStyle w:val="ListNumber"/>
+      </w:pPr>
+      <w:r>
+        <w:t>Masukkan nilai komparasi (Tarif/Tanggal Lama vs Nilai Baru yang Ditetapkan).</w:t>
+      </w:r>
+    </w:p>
+    <w:p>
+      <w:pPr>
+        <w:pStyle w:val="ListNumber"/>
+      </w:pPr>
+      <w:r>
+        <w:t xml:space="preserve">Klik </w:t>
+      </w:r>
+      <w:r>
+        <w:rPr>
+          <w:b/>
+        </w:rPr>
+        <w:t>"✅ Setujui Adendum"</w:t>
+      </w:r>
+      <w:r>
+        <w:t xml:space="preserve">, lalu klik </w:t>
+      </w:r>
+      <w:r>
+        <w:rPr>
+          <w:b/>
+        </w:rPr>
+        <w:t>"⚡ Terapkan ke Kontrak"</w:t>
+      </w:r>
+      <w:r>
+        <w:t xml:space="preserve"> untuk mengupdate data kontrak induk secara otomatis.</w:t>
+      </w:r>
+    </w:p>
+    <w:p>
+      <w:pPr>
+        <w:pStyle w:val="ListNumber"/>
+      </w:pPr>
+      <w:r>
+        <w:t xml:space="preserve">Klik </w:t>
+      </w:r>
+      <w:r>
+        <w:rPr>
+          <w:b/>
+        </w:rPr>
+        <w:t>"🖨️ Cetak Surat Adendum (PDF)"</w:t>
+      </w:r>
+      <w:r>
+        <w:t xml:space="preserve"> untuk mencetak dokumen Surat Perjanjian Perubahan Sewa resmi bertandatangan 2 pihak.</w:t>
       </w:r>
     </w:p>
     <w:p>

</xml_diff>

<commit_message>
feat: Add Phase 8 enterprise features (MEP Asset Checklist, GTO True-Up, Move-Out Clearance, IoT Smart Meter)
- Add MEP Equipment Asset & Mobile Technician Inspection Log (property.mep.asset)
- Add Annual GTO Turnover Rent True-Up Settlement wizard with auto invoice & PDF report
- Add 4-Division Tenant Move-Out Clearance Workflow (property.tenant.clearance) with deposit return PDF
- Add Smart Meter IoT REST Webhook Endpoint (/api/v1/meter/iot_reading)
- Update SOP User Guide (29 Chapters) and UAT Tracker (82 Test Cases)
</commit_message>
<xml_diff>
--- a/Rental Property Management - Odoo 19 Custom Addon/docs/Panduan_Pengguna_Fitur_Sesuai_Alur_Bisnis.docx
+++ b/Rental Property Management - Odoo 19 Custom Addon/docs/Panduan_Pengguna_Fitur_Sesuai_Alur_Bisnis.docx
@@ -3047,6 +3047,382 @@
       </w:r>
       <w:r>
         <w:t xml:space="preserve"> untuk mencetak dokumen Surat Perjanjian Perubahan Sewa resmi bertandatangan 2 pihak.</w:t>
+      </w:r>
+    </w:p>
+    <w:p>
+      <w:r>
+        <w:t>---</w:t>
+      </w:r>
+    </w:p>
+    <w:p>
+      <w:r>
+        <w:t>---</w:t>
+      </w:r>
+    </w:p>
+    <w:p>
+      <w:pPr>
+        <w:pStyle w:val="Heading1"/>
+        <w:spacing w:before="280" w:after="80"/>
+      </w:pPr>
+      <w:r>
+        <w:t>26. Aset MEP Gedung &amp; Checklist Inspeksi Lapangan Teknisi</w:t>
+      </w:r>
+    </w:p>
+    <w:p>
+      <w:r>
+        <w:t>Untuk menjaga keandalan fasilitas kritikal gedung (genset, chiller, lift, pompa hydrant):</w:t>
+      </w:r>
+    </w:p>
+    <w:p>
+      <w:pPr>
+        <w:pStyle w:val="ListNumber"/>
+      </w:pPr>
+      <w:r>
+        <w:t xml:space="preserve">Buka menu: </w:t>
+      </w:r>
+      <w:r>
+        <w:rPr>
+          <w:b/>
+        </w:rPr>
+        <w:t>Rental Management &gt; Aset MEP &amp; Checklist Inspeksi</w:t>
+      </w:r>
+      <w:r>
+        <w:t>.</w:t>
+      </w:r>
+    </w:p>
+    <w:p>
+      <w:pPr>
+        <w:pStyle w:val="ListNumber"/>
+      </w:pPr>
+      <w:r>
+        <w:t>Daftarkan peralatan mekanikal/elektrikal, kode tag aset, dan interval inspeksi.</w:t>
+      </w:r>
+    </w:p>
+    <w:p>
+      <w:pPr>
+        <w:pStyle w:val="ListNumber"/>
+      </w:pPr>
+      <w:r>
+        <w:t>Teknisi lapangan mengisi log inspeksi harian/mingguan (suhu, tegangan listrik, tekanan bar, dan foto temuan).</w:t>
+      </w:r>
+    </w:p>
+    <w:p>
+      <w:pPr>
+        <w:pStyle w:val="ListNumber"/>
+      </w:pPr>
+      <w:r>
+        <w:t>Sistem otomatis mencatat log dan memberikan alert jika status terdeteksi *Warning* atau *Critical*.</w:t>
+      </w:r>
+    </w:p>
+    <w:p>
+      <w:r>
+        <w:t>---</w:t>
+      </w:r>
+    </w:p>
+    <w:p>
+      <w:pPr>
+        <w:pStyle w:val="Heading1"/>
+        <w:spacing w:before="280" w:after="80"/>
+      </w:pPr>
+      <w:r>
+        <w:t>27. Rekonsiliasi Omzet Tahunan (GTO Turnover True-Up Settlement)</w:t>
+      </w:r>
+    </w:p>
+    <w:p>
+      <w:r>
+        <w:t>Khusus tenant retail / mall dengan skema sewa bagi hasil omzet:</w:t>
+      </w:r>
+    </w:p>
+    <w:p>
+      <w:pPr>
+        <w:pStyle w:val="ListNumber"/>
+      </w:pPr>
+      <w:r>
+        <w:t xml:space="preserve">Buka menu: </w:t>
+      </w:r>
+      <w:r>
+        <w:rPr>
+          <w:b/>
+        </w:rPr>
+        <w:t>Rental Management &gt; Contracts &gt; Rekonsiliasi Omzet (True-Up)</w:t>
+      </w:r>
+      <w:r>
+        <w:t>.</w:t>
+      </w:r>
+    </w:p>
+    <w:p>
+      <w:pPr>
+        <w:pStyle w:val="ListNumber"/>
+      </w:pPr>
+      <w:r>
+        <w:t>Pilih Kontrak Sewa Tenant dan Tahun Fiskal Laporan Audit.</w:t>
+      </w:r>
+    </w:p>
+    <w:p>
+      <w:pPr>
+        <w:pStyle w:val="ListNumber"/>
+      </w:pPr>
+      <w:r>
+        <w:t>Masukkan realisasi omzet audited. Sistem otomatis menghitung selisih bagi hasil vs Minimum Guaranteed Rent (MGR).</w:t>
+      </w:r>
+    </w:p>
+    <w:p>
+      <w:pPr>
+        <w:pStyle w:val="ListNumber"/>
+      </w:pPr>
+      <w:r>
+        <w:t xml:space="preserve">Klik </w:t>
+      </w:r>
+      <w:r>
+        <w:rPr>
+          <w:b/>
+        </w:rPr>
+        <w:t>"🧾 Terbitkan Faktur Kekurangan Omzet"</w:t>
+      </w:r>
+      <w:r>
+        <w:t xml:space="preserve"> untuk generate invoice penyesuaian otomatis.</w:t>
+      </w:r>
+    </w:p>
+    <w:p>
+      <w:pPr>
+        <w:pStyle w:val="ListNumber"/>
+      </w:pPr>
+      <w:r>
+        <w:t xml:space="preserve">Klik </w:t>
+      </w:r>
+      <w:r>
+        <w:rPr>
+          <w:b/>
+        </w:rPr>
+        <w:t>"🖨️ Cetak Berita Acara Rekonsiliasi (PDF)"</w:t>
+      </w:r>
+      <w:r>
+        <w:t xml:space="preserve"> sebagai dokumen audit resmi.</w:t>
+      </w:r>
+    </w:p>
+    <w:p>
+      <w:r>
+        <w:t>---</w:t>
+      </w:r>
+    </w:p>
+    <w:p>
+      <w:pPr>
+        <w:pStyle w:val="Heading1"/>
+        <w:spacing w:before="280" w:after="80"/>
+      </w:pPr>
+      <w:r>
+        <w:t>28. Pengakhiran Sewa &amp; Surat Bebas Kewajiban (Move-Out Clearance)</w:t>
+      </w:r>
+    </w:p>
+    <w:p>
+      <w:r>
+        <w:t>Saat masa sewa tenant berakhir (*move-out*):</w:t>
+      </w:r>
+    </w:p>
+    <w:p>
+      <w:pPr>
+        <w:pStyle w:val="ListNumber"/>
+      </w:pPr>
+      <w:r>
+        <w:t xml:space="preserve">Buka menu: </w:t>
+      </w:r>
+      <w:r>
+        <w:rPr>
+          <w:b/>
+        </w:rPr>
+        <w:t>Rental Management &gt; Contracts &gt; Surat Bebas Kewajiban (Clearance)</w:t>
+      </w:r>
+      <w:r>
+        <w:t>.</w:t>
+      </w:r>
+    </w:p>
+    <w:p>
+      <w:pPr>
+        <w:pStyle w:val="ListNumber"/>
+      </w:pPr>
+      <w:r>
+        <w:t>Buat lembar *Clearance*, verifikasi persetujuan 4 divisi:</w:t>
+      </w:r>
+    </w:p>
+    <w:p>
+      <w:pPr>
+        <w:pStyle w:val="ListBullet"/>
+      </w:pPr>
+      <w:r/>
+      <w:r>
+        <w:rPr>
+          <w:b/>
+        </w:rPr>
+        <w:t>Finance</w:t>
+      </w:r>
+      <w:r>
+        <w:t>: Pelunasan sewa dan utilitas terakhir.</w:t>
+      </w:r>
+    </w:p>
+    <w:p>
+      <w:pPr>
+        <w:pStyle w:val="ListBullet"/>
+      </w:pPr>
+      <w:r/>
+      <w:r>
+        <w:rPr>
+          <w:b/>
+        </w:rPr>
+        <w:t>Engineering</w:t>
+      </w:r>
+      <w:r>
+        <w:t>: Pemeriksaan fisik unit &amp; restorasi *bare condition*.</w:t>
+      </w:r>
+    </w:p>
+    <w:p>
+      <w:pPr>
+        <w:pStyle w:val="ListBullet"/>
+      </w:pPr>
+      <w:r/>
+      <w:r>
+        <w:rPr>
+          <w:b/>
+        </w:rPr>
+        <w:t>Housekeeping</w:t>
+      </w:r>
+      <w:r>
+        <w:t>: Pembersihan unit dan bebas sampah.</w:t>
+      </w:r>
+    </w:p>
+    <w:p>
+      <w:pPr>
+        <w:pStyle w:val="ListBullet"/>
+      </w:pPr>
+      <w:r/>
+      <w:r>
+        <w:rPr>
+          <w:b/>
+        </w:rPr>
+        <w:t>Security</w:t>
+      </w:r>
+      <w:r>
+        <w:t>: Pengembalian kartu RFID dan kunci unit.</w:t>
+      </w:r>
+    </w:p>
+    <w:p>
+      <w:pPr>
+        <w:pStyle w:val="ListNumber"/>
+      </w:pPr>
+      <w:r>
+        <w:t>Masukkan potongan kerusakan/utilitas. Sistem otomatis menghitung sisa *Security Deposit* yang wajib dikembalikan.</w:t>
+      </w:r>
+    </w:p>
+    <w:p>
+      <w:pPr>
+        <w:pStyle w:val="ListNumber"/>
+      </w:pPr>
+      <w:r>
+        <w:t xml:space="preserve">Klik </w:t>
+      </w:r>
+      <w:r>
+        <w:rPr>
+          <w:b/>
+        </w:rPr>
+        <w:t>"✅ Setujui Seluruh Divisi"</w:t>
+      </w:r>
+      <w:r>
+        <w:t xml:space="preserve"> dan </w:t>
+      </w:r>
+      <w:r>
+        <w:rPr>
+          <w:b/>
+        </w:rPr>
+        <w:t>"🖨️ Cetak Surat Clearance (PDF)"</w:t>
+      </w:r>
+      <w:r>
+        <w:t>.</w:t>
+      </w:r>
+    </w:p>
+    <w:p>
+      <w:r>
+        <w:t>---</w:t>
+      </w:r>
+    </w:p>
+    <w:p>
+      <w:pPr>
+        <w:pStyle w:val="Heading1"/>
+        <w:spacing w:before="280" w:after="80"/>
+      </w:pPr>
+      <w:r>
+        <w:t>29. Integrasi Smart Meter IoT (Listrik &amp; Air Digital)</w:t>
+      </w:r>
+    </w:p>
+    <w:p>
+      <w:r>
+        <w:t>Gedung yang menggunakan smart meter digital dapat mengirimkan angka meteran langsung:</w:t>
+      </w:r>
+    </w:p>
+    <w:p>
+      <w:pPr>
+        <w:pStyle w:val="ListBullet"/>
+      </w:pPr>
+      <w:r/>
+      <w:r>
+        <w:rPr>
+          <w:b/>
+        </w:rPr>
+        <w:t>API Endpoint</w:t>
+      </w:r>
+      <w:r>
+        <w:t>: `POST /api/v1/meter/iot_reading`</w:t>
+      </w:r>
+    </w:p>
+    <w:p>
+      <w:pPr>
+        <w:pStyle w:val="ListBullet"/>
+      </w:pPr>
+      <w:r/>
+      <w:r>
+        <w:rPr>
+          <w:b/>
+        </w:rPr>
+        <w:t>Payload Format (JSON)</w:t>
+      </w:r>
+      <w:r>
+        <w:t>:</w:t>
+      </w:r>
+    </w:p>
+    <w:p>
+      <w:r>
+        <w:t>```json</w:t>
+      </w:r>
+    </w:p>
+    <w:p>
+      <w:r>
+        <w:t>{</w:t>
+      </w:r>
+    </w:p>
+    <w:p>
+      <w:r>
+        <w:t>"meter_code": "MTR-PLN-GF-01",</w:t>
+      </w:r>
+    </w:p>
+    <w:p>
+      <w:r>
+        <w:t>"current_reading": 14500.50</w:t>
+      </w:r>
+    </w:p>
+    <w:p>
+      <w:r>
+        <w:t>}</w:t>
+      </w:r>
+    </w:p>
+    <w:p>
+      <w:r>
+        <w:t>```</w:t>
+      </w:r>
+    </w:p>
+    <w:p>
+      <w:pPr>
+        <w:pStyle w:val="ListBullet"/>
+      </w:pPr>
+      <w:r>
+        <w:t>Angka meteran terupdate otomatis tanpa intervensi manual.</w:t>
       </w:r>
     </w:p>
     <w:p>

</xml_diff>